<commit_message>
docs: archive completed plans and define F1.2 API delivery
</commit_message>
<xml_diff>
--- a/docs/Auto-Tune后续研发实施计划与工期评估.docx
+++ b/docs/Auto-Tune后续研发实施计划与工期评估.docx
@@ -45,7 +45,7 @@
         <ns0:pStyle ns0:val="Normal"/>
       </ns0:pPr>
       <ns0:r>
-        <ns0:t>不再设置 H1.4。后续顺序为：H1.3 已验收 → F1.1 产品优化与稳定版本冻结 → F1.2 Windows 与 Docker 安装适配 → R1 轻量 Research → Cloud 分批建设。</ns0:t>
+        <ns0:t>不再设置 H1.4。后续顺序为：H1.3 已验收 → F1.1 产品优化与稳定版本冻结 → F1.2 Windows Docker 与 API 交付适配 → R1 轻量 Research → Cloud 分批建设。</ns0:t>
       </ns0:r>
     </ns0:p>
     <ns0:p>
@@ -77,7 +77,7 @@
         <ns0:pStyle ns0:val="Heading2"/>
       </ns0:pPr>
       <ns0:r>
-        <ns0:t>F1.2 Windows 与 Docker 安装适配</ns0:t>
+        <ns0:t>F1.2 Windows Docker 与 API 交付适配</ns0:t>
       </ns0:r>
     </ns0:p>
     <ns0:p>
@@ -85,7 +85,7 @@
         <ns0:pStyle ns0:val="Normal"/>
       </ns0:pPr>
       <ns0:r>
-        <ns0:t>F1.2 只在 F1.1 冻结基线上开展 Windows 安装与单 Docker 镜像适配，包括启动、配置、升级、卸载、CPU/GPU、健康检查和持久化验证。安装包和镜像不得包含真实配置、密钥、数据集、权重、日志或训练产物。Research、Cloud 和公司平台深度接入不自动随 F1.2 启动。</ns0:t>
+        <ns0:t>F1.2 只在 F1.1 冻结基线上开展 Windows 安装、单 Docker 镜像和 API 交付适配，包括启动、配置、升级、卸载、CPU/GPU、健康检查和持久化验证。API 必须覆盖数据分析、直接训练、HPO、LLM 调优、任务状态与日志、停止恢复、结果和受控产物查询，并冻结请求响应 Schema、统一错误码、任务身份、幂等、最小访问边界和路径安全规则；随交付提供 OpenAPI 文档、调用示例、接口烟测和端到端集成验证。Research、Cloud、公司平台深度接入、多人权限、持久队列和多 GPU 调度不自动随 F1.2 启动。</ns0:t>
       </ns0:r>
     </ns0:p>
     <ns0:p>

</xml_diff>

<commit_message>
feat: complete F1.1 product optimization and freeze
</commit_message>
<xml_diff>
--- a/docs/Auto-Tune后续研发实施计划与工期评估.docx
+++ b/docs/Auto-Tune后续研发实施计划与工期评估.docx
@@ -21,7 +21,7 @@
         <ns0:pStyle ns0:val="Heading2"/>
       </ns0:pPr>
       <ns0:r>
-        <ns0:t>2026-09-16 当前执行结论</ns0:t>
+        <ns0:t>2026-09-18 当前执行结论</ns0:t>
       </ns0:r>
     </ns0:p>
     <ns0:p>
@@ -29,7 +29,7 @@
         <ns0:pStyle ns0:val="Normal"/>
       </ns0:pPr>
       <ns0:r>
-        <ns0:t>H1.1、H1.2、H1.3 已完成实现、独立验证和人工体验确认，H1 Detect HPO 业务线验收结束。智能训练页面现已统一提供干运行预览、按原参数训练、HPO 算法调参和大模型调参；直接训练、HPO、LLM 三条真实训练路线均可完整执行。</ns0:t>
+        <ns0:t>F1.1-A、F1.1-B、F1.1-C 已全部完成。艾卡于 2026-09-18 确认 F1.1 整体验收通过并冻结；当前正式业务继续限定为 YOLOv8 Detect。</ns0:t>
       </ns0:r>
     </ns0:p>
     <ns0:p>
@@ -37,7 +37,7 @@
         <ns0:pStyle ns0:val="Normal"/>
       </ns0:pPr>
       <ns0:r>
-        <ns0:t>H1.3 完整自动化基线为 2426 passed、2 warnings、0 skipped。艾卡完成真实 GPU 正式训练验证：train63 使用 device=0、epochs=25、batch=16、imgsz=640 正常完成，页面状态收敛为 completed，最终显示 mAP50=0.6454、mAP50-95=0.3275；结果目录、YOLO 静态图、最终权重和入口均正常。</ns0:t>
+        <ns0:t>验收证据：F1.1-B 定向测试 114 passed；F1.1-C 最终完整自动化 2738 passed、2 warnings，两条警告均为既有 sklearn PCA warning；动态运行名安全行为测试 16 passed。艾卡完成 3–4 组真实训练结果体验验证。</ns0:t>
       </ns0:r>
     </ns0:p>
     <ns0:p>
@@ -45,7 +45,31 @@
         <ns0:pStyle ns0:val="Normal"/>
       </ns0:pPr>
       <ns0:r>
-        <ns0:t>不再设置 H1.4。后续顺序为：H1.3 已验收 → F1.1 产品优化与稳定版本冻结 → F1.2 Windows Docker 与 API 交付适配 → R1 轻量 Research → Cloud 分批建设。</ns0:t>
+        <ns0:t>当前顺序：F1.1 已验收并冻结 → F1.2 Windows、单 Docker 镜像与 API 交付适配 → R1 轻量 Research → Cloud 分批建设。</ns0:t>
+      </ns0:r>
+    </ns0:p>
+    <ns0:p>
+      <ns0:pPr>
+        <ns0:pStyle ns0:val="Normal"/>
+      </ns0:pPr>
+      <ns0:r>
+        <ns0:t>版本管理：F1.1 统一执行文件清单、敏感信息、测试证据和 .gitignore 检查后，提交并推送指定 GitHub 仓库；后续不再执行 F1.1 的旧提示词。</ns0:t>
+      </ns0:r>
+    </ns0:p>
+    <ns0:p>
+      <ns0:pPr>
+        <ns0:pStyle ns0:val="Heading2"/>
+      </ns0:pPr>
+      <ns0:r>
+        <ns0:t>软件操作手册</ns0:t>
+      </ns0:r>
+    </ns0:p>
+    <ns0:p>
+      <ns0:pPr>
+        <ns0:pStyle ns0:val="Normal"/>
+      </ns0:pPr>
+      <ns0:r>
+        <ns0:t>现行操作说明见《Auto Tune Studio 软件操作手册》。手册覆盖项目信息录入、大模型信息录入、数据集分析、LLM 调优、HPO 调优、正常训练和历史记录。软件安装、部署、升级与卸载不在本批说明，待下一 Part 完成验收后另行编写安装手册。</ns0:t>
       </ns0:r>
     </ns0:p>
     <ns0:p>
@@ -61,7 +85,7 @@
         <ns0:pStyle ns0:val="Normal"/>
       </ns0:pPr>
       <ns0:r>
-        <ns0:t>F1.1 不扩展新的主体训练能力。当前范围包括：HPO 权重上传及少量常用权重预置、主操作按钮位置调整、轻量动态进度展示；LLM 加入事实推断后准确率下降的专项复现和修复；三条真实训练路线的失败、停止、恢复、刷新和重启回归；以及对重复实现、职责混杂、超大文件和不必要依赖的证据化结构审计。</ns0:t>
+        <ns0:t>F1.1 已完成体验优化、LLM 效果专项、三条训练路线稳定审查及必要最小修复。冻结后不进行大规模结构重写；只有阻断缺陷、安全问题或 F1.2 交付适配的必要变化才进入后续规格。</ns0:t>
       </ns0:r>
     </ns0:p>
     <ns0:p>
@@ -69,7 +93,7 @@
         <ns0:pStyle ns0:val="Normal"/>
       </ns0:pPr>
       <ns0:r>
-        <ns0:t>F1.1 不开发 HPO 实时 loss/mAP 曲线或 GPU、显存、温度图表，不在稳定化阶段进行大规模重写。退出时应冻结核心训练接口、运行身份、数据快照、产物和历史协议，并完成完整自动化、必要真实训练和浏览器走查。</ns0:t>
+        <ns0:t>F1.1 冻结结论：未发现未处置的 P0/P1；文件较大、轻微重复或代码风格不触发修改。‘AI 判断无需调整超参数’以 keep_params 正常结束且不启动训练，属于已验证语义。</ns0:t>
       </ns0:r>
     </ns0:p>
     <ns0:p>
@@ -101,7 +125,7 @@
         <ns0:pStyle ns0:val="Normal"/>
       </ns0:pPr>
       <ns0:r>
-        <ns0:t>下文保留既有技术边界和历史估算供追溯。凡与以上 2026-09-16 状态、阶段名称和启动顺序冲突的旧说明均不再作为当前执行依据。</ns0:t>
+        <ns0:t>下文保留既有技术边界和历史估算供追溯。凡与以上 2026-09-18 状态、阶段名称和启动顺序冲突的旧说明均不再作为当前执行依据。</ns0:t>
       </ns0:r>
     </ns0:p>
     <ns0:p>
@@ -827,9 +851,9 @@
         <ns0:spacing ns0:after="110" ns0:line="340" ns0:lineRule="auto"/>
         <ns0:widowControl/>
       </ns0:pPr>
-      <w:r xmlns:w="http://schemas.openxmlformats.org/wordprocessingml/2006/main">
-        <w:t>编码入口：H1.1、H1.2 均已独立验收通过；当前无未完成 H1.2 返修项。下一步由 Codex 制定 H1.3 Studio 接入规格与计划，不复用已归档的 H1.2 编码或返修提示词。</w:t>
-      </w:r>
+      <ns0:r>
+        <ns0:t>完成记录：H1 与 F1.1 均已验收。下一入口为 F1.2 Windows、单 Docker 镜像与 API 交付适配。</ns0:t>
+      </ns0:r>
     </ns0:p>
     <ns0:p>
       <ns0:pPr>

</xml_diff>